<commit_message>
Schema Compare Excel Writer
</commit_message>
<xml_diff>
--- a/src/test/resources/samples/MCB.BIM.TBL.PROVINCES.V1.2.docx
+++ b/src/test/resources/samples/MCB.BIM.TBL.PROVINCES.V1.2.docx
@@ -3393,6 +3393,19 @@
                 <w:szCs w:val="18"/>
               </w:rPr>
             </w:pPr>
+            <w:r>
+              <w:rPr>
+                <w:rFonts w:asciiTheme="majorBidi" w:hAnsiTheme="majorBidi"/>
+                <w:b w:val="0"/>
+                <w:bCs w:val="0"/>
+                <w:i w:val="0"/>
+                <w:iCs w:val="0"/>
+                <w:color w:val="000000"/>
+                <w:sz w:val="18"/>
+                <w:szCs w:val="18"/>
+              </w:rPr>
+              <w:t>U2</w:t>
+            </w:r>
           </w:p>
         </w:tc>
         <w:tc>
@@ -3704,15 +3717,34 @@
           </w:tcPr>
           <w:p>
             <w:pPr>
-              <w:bidi w:val="0"/>
-              <w:spacing w:after="0" w:line="240" w:lineRule="auto"/>
-              <w:jc w:val="center"/>
-              <w:rPr>
-                <w:rFonts w:asciiTheme="majorBidi" w:hAnsiTheme="majorBidi" w:cstheme="majorBidi"/>
-                <w:b/>
-                <w:bCs/>
-              </w:rPr>
-            </w:pPr>
+              <w:pStyle w:val="Heading4"/>
+              <w:bidi w:val="0"/>
+              <w:spacing w:before="0"/>
+              <w:jc w:val="center"/>
+              <w:rPr>
+                <w:rFonts w:asciiTheme="majorBidi" w:hAnsiTheme="majorBidi"/>
+                <w:b w:val="0"/>
+                <w:bCs w:val="0"/>
+                <w:i w:val="0"/>
+                <w:iCs w:val="0"/>
+                <w:color w:val="000000"/>
+                <w:sz w:val="18"/>
+                <w:szCs w:val="18"/>
+              </w:rPr>
+            </w:pPr>
+            <w:r>
+              <w:rPr>
+                <w:rFonts w:asciiTheme="majorBidi" w:hAnsiTheme="majorBidi"/>
+                <w:b w:val="0"/>
+                <w:bCs w:val="0"/>
+                <w:i w:val="0"/>
+                <w:iCs w:val="0"/>
+                <w:color w:val="000000"/>
+                <w:sz w:val="18"/>
+                <w:szCs w:val="18"/>
+              </w:rPr>
+              <w:t>I1</w:t>
+            </w:r>
           </w:p>
         </w:tc>
         <w:tc>
@@ -13527,6 +13559,7 @@
     <w:rsid w:val="002C61F9"/>
     <w:rsid w:val="002C7BCE"/>
     <w:rsid w:val="002E4266"/>
+    <w:rsid w:val="00305C6F"/>
     <w:rsid w:val="003205E6"/>
     <w:rsid w:val="00325927"/>
     <w:rsid w:val="00325958"/>
@@ -13545,6 +13578,7 @@
     <w:rsid w:val="004642EF"/>
     <w:rsid w:val="004A5DF0"/>
     <w:rsid w:val="004B5A33"/>
+    <w:rsid w:val="004D1C53"/>
     <w:rsid w:val="004D79FD"/>
     <w:rsid w:val="00514632"/>
     <w:rsid w:val="005278D4"/>

</xml_diff>